<commit_message>
update(out source): Update project
</commit_message>
<xml_diff>
--- a/Slot13/saga-demo/Bao_cao_de190477.docx
+++ b/Slot13/saga-demo/Bao_cao_de190477.docx
@@ -687,25 +687,10 @@
           <w:rFonts w:hint="default"/>
           <w:lang w:val="vi-VN"/>
         </w:rPr>
-        <w:t>Chạy cái số 4 để mở log saga lên. Từ đó có thể biết được rằng là hệ thống đang và đã vận hành như nào thông qua messenge kalfa. Từ đó có thể khiến các dịch vụ khác đọc được và revert tra</w:t>
-      </w:r>
-      <w:bookmarkStart w:id="0" w:name="_GoBack"/>
-      <w:bookmarkEnd w:id="0"/>
-      <w:r>
-        <w:rPr>
-          <w:rFonts w:hint="default"/>
-          <w:lang w:val="vi-VN"/>
-        </w:rPr>
-        <w:t>nsaction lại</w:t>
+        <w:t>Chạy cái số 4 để mở log saga lên. Từ đó có thể biết được rằng là hệ thống đang và đã vận hành như nào thông qua messenge kalfa. Từ đó có thể khiến các dịch vụ khác đọc được và revert transaction lại</w:t>
       </w:r>
     </w:p>
     <w:p>
-      <w:pPr>
-        <w:rPr>
-          <w:rFonts w:hint="default"/>
-          <w:lang w:val="vi-VN"/>
-        </w:rPr>
-      </w:pPr>
       <w:r>
         <w:drawing>
           <wp:inline distT="0" distB="0" distL="114300" distR="114300">
@@ -749,6 +734,167 @@
           </wp:inline>
         </w:drawing>
       </w:r>
+    </w:p>
+    <w:p>
+      <w:r>
+        <w:br w:type="page"/>
+      </w:r>
+    </w:p>
+    <w:p>
+      <w:pPr>
+        <w:rPr>
+          <w:rFonts w:hint="default"/>
+          <w:sz w:val="40"/>
+          <w:szCs w:val="40"/>
+          <w:lang w:val="vi-VN"/>
+        </w:rPr>
+      </w:pPr>
+      <w:r>
+        <w:rPr>
+          <w:rFonts w:hint="default"/>
+          <w:sz w:val="40"/>
+          <w:szCs w:val="40"/>
+          <w:lang w:val="en-US"/>
+        </w:rPr>
+        <w:t>Quy tr</w:t>
+      </w:r>
+      <w:r>
+        <w:rPr>
+          <w:rFonts w:hint="default"/>
+          <w:sz w:val="40"/>
+          <w:szCs w:val="40"/>
+          <w:lang w:val="vi-VN"/>
+        </w:rPr>
+        <w:t>ình test kịch bản 8 (khi retry bị fail 3 lần khiến đơn hàng bị treo)</w:t>
+      </w:r>
+    </w:p>
+    <w:p>
+      <w:pPr>
+        <w:rPr>
+          <w:rFonts w:hint="default"/>
+          <w:sz w:val="26"/>
+          <w:szCs w:val="26"/>
+          <w:lang w:val="vi-VN"/>
+        </w:rPr>
+      </w:pPr>
+    </w:p>
+    <w:p>
+      <w:pPr>
+        <w:rPr>
+          <w:rFonts w:hint="default"/>
+          <w:sz w:val="26"/>
+          <w:szCs w:val="26"/>
+          <w:lang w:val="vi-VN"/>
+        </w:rPr>
+      </w:pPr>
+      <w:r>
+        <w:rPr>
+          <w:rFonts w:hint="default"/>
+          <w:sz w:val="26"/>
+          <w:szCs w:val="26"/>
+          <w:lang w:val="vi-VN"/>
+        </w:rPr>
+        <w:t>Bước 1: Thiết lập delay khi chạy bằng docker</w:t>
+      </w:r>
+    </w:p>
+    <w:p>
+      <w:pPr>
+        <w:rPr>
+          <w:rFonts w:hint="default"/>
+          <w:sz w:val="26"/>
+          <w:szCs w:val="26"/>
+          <w:lang w:val="vi-VN"/>
+        </w:rPr>
+      </w:pPr>
+      <w:r>
+        <w:rPr>
+          <w:rFonts w:hint="default"/>
+          <w:sz w:val="26"/>
+          <w:szCs w:val="26"/>
+          <w:lang w:val="vi-VN"/>
+        </w:rPr>
+        <w:t>Sử dụng dòng lệnh dán vào terminal rồi chạy dưới đây:</w:t>
+      </w:r>
+    </w:p>
+    <w:p>
+      <w:pPr>
+        <w:rPr>
+          <w:rFonts w:hint="default"/>
+          <w:sz w:val="26"/>
+          <w:szCs w:val="26"/>
+          <w:lang w:val="vi-VN"/>
+        </w:rPr>
+      </w:pPr>
+    </w:p>
+    <w:p>
+      <w:pPr>
+        <w:rPr>
+          <w:rFonts w:hint="default"/>
+          <w:sz w:val="26"/>
+          <w:szCs w:val="26"/>
+          <w:lang w:val="vi-VN"/>
+        </w:rPr>
+      </w:pPr>
+      <w:r>
+        <w:rPr>
+          <w:rFonts w:hint="default"/>
+          <w:sz w:val="26"/>
+          <w:szCs w:val="26"/>
+          <w:lang w:val="vi-VN"/>
+        </w:rPr>
+        <w:t xml:space="preserve">$env:PAYMENT_DELAY_MS=15000; </w:t>
+      </w:r>
+    </w:p>
+    <w:p>
+      <w:pPr>
+        <w:rPr>
+          <w:rFonts w:hint="default"/>
+          <w:sz w:val="26"/>
+          <w:szCs w:val="26"/>
+          <w:lang w:val="vi-VN"/>
+        </w:rPr>
+      </w:pPr>
+      <w:r>
+        <w:rPr>
+          <w:rFonts w:hint="default"/>
+          <w:sz w:val="26"/>
+          <w:szCs w:val="26"/>
+          <w:lang w:val="vi-VN"/>
+        </w:rPr>
+        <w:t>docker compose up -d order-service</w:t>
+      </w:r>
+    </w:p>
+    <w:p>
+      <w:pPr>
+        <w:rPr>
+          <w:rFonts w:hint="default"/>
+          <w:sz w:val="26"/>
+          <w:szCs w:val="26"/>
+          <w:lang w:val="vi-VN"/>
+        </w:rPr>
+      </w:pPr>
+    </w:p>
+    <w:p>
+      <w:pPr>
+        <w:rPr>
+          <w:rFonts w:hint="default"/>
+          <w:sz w:val="26"/>
+          <w:szCs w:val="26"/>
+          <w:lang w:val="vi-VN"/>
+        </w:rPr>
+      </w:pPr>
+      <w:bookmarkStart w:id="0" w:name="_GoBack"/>
+      <w:bookmarkEnd w:id="0"/>
+    </w:p>
+    <w:p>
+      <w:pPr>
+        <w:rPr>
+          <w:rFonts w:hint="default"/>
+          <w:sz w:val="26"/>
+          <w:szCs w:val="26"/>
+          <w:lang w:val="vi-VN"/>
+        </w:rPr>
+      </w:pPr>
     </w:p>
     <w:sectPr>
       <w:headerReference r:id="rId3" w:type="default"/>
@@ -1047,15 +1193,15 @@
     <w:lsdException w:qFormat="1" w:uiPriority="0" w:name="heading 7"/>
     <w:lsdException w:qFormat="1" w:uiPriority="0" w:name="heading 8"/>
     <w:lsdException w:qFormat="1" w:uiPriority="0" w:name="heading 9"/>
-    <w:lsdException w:unhideWhenUsed="0" w:uiPriority="0" w:semiHidden="0" w:name="index 1"/>
-    <w:lsdException w:unhideWhenUsed="0" w:uiPriority="0" w:semiHidden="0" w:name="index 2"/>
-    <w:lsdException w:unhideWhenUsed="0" w:uiPriority="0" w:semiHidden="0" w:name="index 3"/>
-    <w:lsdException w:unhideWhenUsed="0" w:uiPriority="0" w:semiHidden="0" w:name="index 4"/>
-    <w:lsdException w:unhideWhenUsed="0" w:uiPriority="0" w:semiHidden="0" w:name="index 5"/>
+    <w:lsdException w:qFormat="1" w:unhideWhenUsed="0" w:uiPriority="0" w:semiHidden="0" w:name="index 1"/>
+    <w:lsdException w:qFormat="1" w:unhideWhenUsed="0" w:uiPriority="0" w:semiHidden="0" w:name="index 2"/>
+    <w:lsdException w:qFormat="1" w:unhideWhenUsed="0" w:uiPriority="0" w:semiHidden="0" w:name="index 3"/>
+    <w:lsdException w:qFormat="1" w:unhideWhenUsed="0" w:uiPriority="0" w:semiHidden="0" w:name="index 4"/>
+    <w:lsdException w:qFormat="1" w:unhideWhenUsed="0" w:uiPriority="0" w:semiHidden="0" w:name="index 5"/>
     <w:lsdException w:unhideWhenUsed="0" w:uiPriority="0" w:semiHidden="0" w:name="index 6"/>
-    <w:lsdException w:unhideWhenUsed="0" w:uiPriority="0" w:semiHidden="0" w:name="index 7"/>
-    <w:lsdException w:unhideWhenUsed="0" w:uiPriority="0" w:semiHidden="0" w:name="index 8"/>
-    <w:lsdException w:unhideWhenUsed="0" w:uiPriority="0" w:semiHidden="0" w:name="index 9"/>
+    <w:lsdException w:qFormat="1" w:unhideWhenUsed="0" w:uiPriority="0" w:semiHidden="0" w:name="index 7"/>
+    <w:lsdException w:qFormat="1" w:unhideWhenUsed="0" w:uiPriority="0" w:semiHidden="0" w:name="index 8"/>
+    <w:lsdException w:qFormat="1" w:unhideWhenUsed="0" w:uiPriority="0" w:semiHidden="0" w:name="index 9"/>
     <w:lsdException w:qFormat="1" w:unhideWhenUsed="0" w:uiPriority="0" w:semiHidden="0" w:name="toc 1"/>
     <w:lsdException w:qFormat="1" w:unhideWhenUsed="0" w:uiPriority="0" w:semiHidden="0" w:name="toc 2"/>
     <w:lsdException w:qFormat="1" w:unhideWhenUsed="0" w:uiPriority="0" w:semiHidden="0" w:name="toc 3"/>
@@ -1066,38 +1212,38 @@
     <w:lsdException w:qFormat="1" w:unhideWhenUsed="0" w:uiPriority="0" w:semiHidden="0" w:name="toc 8"/>
     <w:lsdException w:qFormat="1" w:unhideWhenUsed="0" w:uiPriority="0" w:semiHidden="0" w:name="toc 9"/>
     <w:lsdException w:qFormat="1" w:unhideWhenUsed="0" w:uiPriority="0" w:semiHidden="0" w:name="Normal Indent"/>
-    <w:lsdException w:unhideWhenUsed="0" w:uiPriority="0" w:semiHidden="0" w:name="footnote text"/>
+    <w:lsdException w:qFormat="1" w:unhideWhenUsed="0" w:uiPriority="0" w:semiHidden="0" w:name="footnote text"/>
     <w:lsdException w:qFormat="1" w:unhideWhenUsed="0" w:uiPriority="0" w:semiHidden="0" w:name="annotation text"/>
-    <w:lsdException w:unhideWhenUsed="0" w:uiPriority="0" w:semiHidden="0" w:name="header"/>
-    <w:lsdException w:unhideWhenUsed="0" w:uiPriority="0" w:semiHidden="0" w:name="footer"/>
-    <w:lsdException w:unhideWhenUsed="0" w:uiPriority="0" w:semiHidden="0" w:name="index heading"/>
+    <w:lsdException w:qFormat="1" w:unhideWhenUsed="0" w:uiPriority="0" w:semiHidden="0" w:name="header"/>
+    <w:lsdException w:qFormat="1" w:unhideWhenUsed="0" w:uiPriority="0" w:semiHidden="0" w:name="footer"/>
+    <w:lsdException w:qFormat="1" w:unhideWhenUsed="0" w:uiPriority="0" w:semiHidden="0" w:name="index heading"/>
     <w:lsdException w:qFormat="1" w:uiPriority="0" w:name="caption"/>
     <w:lsdException w:qFormat="1" w:unhideWhenUsed="0" w:uiPriority="0" w:semiHidden="0" w:name="table of figures"/>
-    <w:lsdException w:unhideWhenUsed="0" w:uiPriority="0" w:semiHidden="0" w:name="envelope address"/>
-    <w:lsdException w:unhideWhenUsed="0" w:uiPriority="0" w:semiHidden="0" w:name="envelope return"/>
+    <w:lsdException w:qFormat="1" w:unhideWhenUsed="0" w:uiPriority="0" w:semiHidden="0" w:name="envelope address"/>
+    <w:lsdException w:qFormat="1" w:unhideWhenUsed="0" w:uiPriority="0" w:semiHidden="0" w:name="envelope return"/>
     <w:lsdException w:unhideWhenUsed="0" w:uiPriority="0" w:semiHidden="0" w:name="footnote reference"/>
     <w:lsdException w:qFormat="1" w:unhideWhenUsed="0" w:uiPriority="0" w:semiHidden="0" w:name="annotation reference"/>
-    <w:lsdException w:unhideWhenUsed="0" w:uiPriority="0" w:semiHidden="0" w:name="line number"/>
+    <w:lsdException w:qFormat="1" w:unhideWhenUsed="0" w:uiPriority="0" w:semiHidden="0" w:name="line number"/>
     <w:lsdException w:qFormat="1" w:unhideWhenUsed="0" w:uiPriority="0" w:semiHidden="0" w:name="page number"/>
-    <w:lsdException w:unhideWhenUsed="0" w:uiPriority="0" w:semiHidden="0" w:name="endnote reference"/>
-    <w:lsdException w:unhideWhenUsed="0" w:uiPriority="0" w:semiHidden="0" w:name="endnote text"/>
+    <w:lsdException w:qFormat="1" w:unhideWhenUsed="0" w:uiPriority="0" w:semiHidden="0" w:name="endnote reference"/>
+    <w:lsdException w:qFormat="1" w:unhideWhenUsed="0" w:uiPriority="0" w:semiHidden="0" w:name="endnote text"/>
     <w:lsdException w:qFormat="1" w:unhideWhenUsed="0" w:uiPriority="0" w:semiHidden="0" w:name="table of authorities"/>
     <w:lsdException w:qFormat="1" w:unhideWhenUsed="0" w:uiPriority="0" w:semiHidden="0" w:name="macro"/>
     <w:lsdException w:qFormat="1" w:unhideWhenUsed="0" w:uiPriority="0" w:semiHidden="0" w:name="toa heading"/>
-    <w:lsdException w:unhideWhenUsed="0" w:uiPriority="0" w:semiHidden="0" w:name="List"/>
-    <w:lsdException w:unhideWhenUsed="0" w:uiPriority="0" w:semiHidden="0" w:name="List Bullet"/>
+    <w:lsdException w:qFormat="1" w:unhideWhenUsed="0" w:uiPriority="0" w:semiHidden="0" w:name="List"/>
+    <w:lsdException w:qFormat="1" w:unhideWhenUsed="0" w:uiPriority="0" w:semiHidden="0" w:name="List Bullet"/>
     <w:lsdException w:qFormat="1" w:unhideWhenUsed="0" w:uiPriority="0" w:semiHidden="0" w:name="List Number"/>
-    <w:lsdException w:unhideWhenUsed="0" w:uiPriority="0" w:semiHidden="0" w:name="List 2"/>
+    <w:lsdException w:qFormat="1" w:unhideWhenUsed="0" w:uiPriority="0" w:semiHidden="0" w:name="List 2"/>
     <w:lsdException w:unhideWhenUsed="0" w:uiPriority="0" w:semiHidden="0" w:name="List 3"/>
-    <w:lsdException w:unhideWhenUsed="0" w:uiPriority="0" w:semiHidden="0" w:name="List 4"/>
-    <w:lsdException w:unhideWhenUsed="0" w:uiPriority="0" w:semiHidden="0" w:name="List 5"/>
+    <w:lsdException w:qFormat="1" w:unhideWhenUsed="0" w:uiPriority="0" w:semiHidden="0" w:name="List 4"/>
+    <w:lsdException w:qFormat="1" w:unhideWhenUsed="0" w:uiPriority="0" w:semiHidden="0" w:name="List 5"/>
     <w:lsdException w:qFormat="1" w:unhideWhenUsed="0" w:uiPriority="0" w:semiHidden="0" w:name="List Bullet 2"/>
     <w:lsdException w:qFormat="1" w:unhideWhenUsed="0" w:uiPriority="0" w:semiHidden="0" w:name="List Bullet 3"/>
     <w:lsdException w:qFormat="1" w:unhideWhenUsed="0" w:uiPriority="0" w:semiHidden="0" w:name="List Bullet 4"/>
     <w:lsdException w:qFormat="1" w:unhideWhenUsed="0" w:uiPriority="0" w:semiHidden="0" w:name="List Bullet 5"/>
     <w:lsdException w:qFormat="1" w:unhideWhenUsed="0" w:uiPriority="0" w:semiHidden="0" w:name="List Number 2"/>
     <w:lsdException w:qFormat="1" w:unhideWhenUsed="0" w:uiPriority="0" w:semiHidden="0" w:name="List Number 3"/>
-    <w:lsdException w:unhideWhenUsed="0" w:uiPriority="0" w:semiHidden="0" w:name="List Number 4"/>
+    <w:lsdException w:qFormat="1" w:unhideWhenUsed="0" w:uiPriority="0" w:semiHidden="0" w:name="List Number 4"/>
     <w:lsdException w:qFormat="1" w:unhideWhenUsed="0" w:uiPriority="0" w:semiHidden="0" w:name="List Number 5"/>
     <w:lsdException w:qFormat="1" w:unhideWhenUsed="0" w:uiPriority="0" w:semiHidden="0" w:name="Title"/>
     <w:lsdException w:qFormat="1" w:unhideWhenUsed="0" w:uiPriority="0" w:semiHidden="0" w:name="Closing"/>
@@ -1112,34 +1258,34 @@
     <w:lsdException w:qFormat="1" w:unhideWhenUsed="0" w:uiPriority="0" w:semiHidden="0" w:name="List Continue 5"/>
     <w:lsdException w:qFormat="1" w:unhideWhenUsed="0" w:uiPriority="0" w:semiHidden="0" w:name="Message Header"/>
     <w:lsdException w:qFormat="1" w:unhideWhenUsed="0" w:uiPriority="0" w:semiHidden="0" w:name="Subtitle"/>
-    <w:lsdException w:unhideWhenUsed="0" w:uiPriority="0" w:semiHidden="0" w:name="Salutation"/>
+    <w:lsdException w:qFormat="1" w:unhideWhenUsed="0" w:uiPriority="0" w:semiHidden="0" w:name="Salutation"/>
     <w:lsdException w:qFormat="1" w:unhideWhenUsed="0" w:uiPriority="0" w:semiHidden="0" w:name="Date"/>
     <w:lsdException w:qFormat="1" w:unhideWhenUsed="0" w:uiPriority="0" w:semiHidden="0" w:name="Body Text First Indent"/>
-    <w:lsdException w:unhideWhenUsed="0" w:uiPriority="0" w:semiHidden="0" w:name="Body Text First Indent 2"/>
+    <w:lsdException w:qFormat="1" w:unhideWhenUsed="0" w:uiPriority="0" w:semiHidden="0" w:name="Body Text First Indent 2"/>
     <w:lsdException w:qFormat="1" w:unhideWhenUsed="0" w:uiPriority="0" w:semiHidden="0" w:name="Note Heading"/>
-    <w:lsdException w:unhideWhenUsed="0" w:uiPriority="0" w:semiHidden="0" w:name="Body Text 2"/>
+    <w:lsdException w:qFormat="1" w:unhideWhenUsed="0" w:uiPriority="0" w:semiHidden="0" w:name="Body Text 2"/>
     <w:lsdException w:qFormat="1" w:unhideWhenUsed="0" w:uiPriority="0" w:semiHidden="0" w:name="Body Text 3"/>
     <w:lsdException w:qFormat="1" w:unhideWhenUsed="0" w:uiPriority="0" w:semiHidden="0" w:name="Body Text Indent 2"/>
     <w:lsdException w:qFormat="1" w:unhideWhenUsed="0" w:uiPriority="0" w:semiHidden="0" w:name="Body Text Indent 3"/>
-    <w:lsdException w:unhideWhenUsed="0" w:uiPriority="0" w:semiHidden="0" w:name="Block Text"/>
-    <w:lsdException w:unhideWhenUsed="0" w:uiPriority="0" w:semiHidden="0" w:name="Hyperlink"/>
-    <w:lsdException w:unhideWhenUsed="0" w:uiPriority="0" w:semiHidden="0" w:name="FollowedHyperlink"/>
+    <w:lsdException w:qFormat="1" w:unhideWhenUsed="0" w:uiPriority="0" w:semiHidden="0" w:name="Block Text"/>
+    <w:lsdException w:qFormat="1" w:unhideWhenUsed="0" w:uiPriority="0" w:semiHidden="0" w:name="Hyperlink"/>
+    <w:lsdException w:qFormat="1" w:unhideWhenUsed="0" w:uiPriority="0" w:semiHidden="0" w:name="FollowedHyperlink"/>
     <w:lsdException w:qFormat="1" w:unhideWhenUsed="0" w:uiPriority="0" w:semiHidden="0" w:name="Strong"/>
     <w:lsdException w:qFormat="1" w:unhideWhenUsed="0" w:uiPriority="0" w:semiHidden="0" w:name="Emphasis"/>
-    <w:lsdException w:unhideWhenUsed="0" w:uiPriority="0" w:semiHidden="0" w:name="Document Map"/>
-    <w:lsdException w:unhideWhenUsed="0" w:uiPriority="0" w:semiHidden="0" w:name="Plain Text"/>
-    <w:lsdException w:unhideWhenUsed="0" w:uiPriority="0" w:semiHidden="0" w:name="E-mail Signature"/>
+    <w:lsdException w:qFormat="1" w:unhideWhenUsed="0" w:uiPriority="0" w:semiHidden="0" w:name="Document Map"/>
+    <w:lsdException w:qFormat="1" w:unhideWhenUsed="0" w:uiPriority="0" w:semiHidden="0" w:name="Plain Text"/>
+    <w:lsdException w:qFormat="1" w:unhideWhenUsed="0" w:uiPriority="0" w:semiHidden="0" w:name="E-mail Signature"/>
     <w:lsdException w:qFormat="1" w:unhideWhenUsed="0" w:uiPriority="0" w:semiHidden="0" w:name="Normal (Web)"/>
-    <w:lsdException w:unhideWhenUsed="0" w:uiPriority="0" w:semiHidden="0" w:name="HTML Acronym"/>
-    <w:lsdException w:unhideWhenUsed="0" w:uiPriority="0" w:semiHidden="0" w:name="HTML Address"/>
-    <w:lsdException w:unhideWhenUsed="0" w:uiPriority="0" w:semiHidden="0" w:name="HTML Cite"/>
-    <w:lsdException w:unhideWhenUsed="0" w:uiPriority="0" w:semiHidden="0" w:name="HTML Code"/>
-    <w:lsdException w:unhideWhenUsed="0" w:uiPriority="0" w:semiHidden="0" w:name="HTML Definition"/>
-    <w:lsdException w:unhideWhenUsed="0" w:uiPriority="0" w:semiHidden="0" w:name="HTML Keyboard"/>
-    <w:lsdException w:unhideWhenUsed="0" w:uiPriority="0" w:semiHidden="0" w:name="HTML Preformatted"/>
-    <w:lsdException w:unhideWhenUsed="0" w:uiPriority="0" w:semiHidden="0" w:name="HTML Sample"/>
-    <w:lsdException w:unhideWhenUsed="0" w:uiPriority="0" w:semiHidden="0" w:name="HTML Typewriter"/>
-    <w:lsdException w:unhideWhenUsed="0" w:uiPriority="0" w:semiHidden="0" w:name="HTML Variable"/>
+    <w:lsdException w:qFormat="1" w:unhideWhenUsed="0" w:uiPriority="0" w:semiHidden="0" w:name="HTML Acronym"/>
+    <w:lsdException w:qFormat="1" w:unhideWhenUsed="0" w:uiPriority="0" w:semiHidden="0" w:name="HTML Address"/>
+    <w:lsdException w:qFormat="1" w:unhideWhenUsed="0" w:uiPriority="0" w:semiHidden="0" w:name="HTML Cite"/>
+    <w:lsdException w:qFormat="1" w:unhideWhenUsed="0" w:uiPriority="0" w:semiHidden="0" w:name="HTML Code"/>
+    <w:lsdException w:qFormat="1" w:unhideWhenUsed="0" w:uiPriority="0" w:semiHidden="0" w:name="HTML Definition"/>
+    <w:lsdException w:qFormat="1" w:unhideWhenUsed="0" w:uiPriority="0" w:semiHidden="0" w:name="HTML Keyboard"/>
+    <w:lsdException w:qFormat="1" w:unhideWhenUsed="0" w:uiPriority="0" w:semiHidden="0" w:name="HTML Preformatted"/>
+    <w:lsdException w:qFormat="1" w:unhideWhenUsed="0" w:uiPriority="0" w:semiHidden="0" w:name="HTML Sample"/>
+    <w:lsdException w:qFormat="1" w:unhideWhenUsed="0" w:uiPriority="0" w:semiHidden="0" w:name="HTML Typewriter"/>
+    <w:lsdException w:qFormat="1" w:unhideWhenUsed="0" w:uiPriority="0" w:semiHidden="0" w:name="HTML Variable"/>
     <w:lsdException w:qFormat="1" w:unhideWhenUsed="0" w:uiPriority="0" w:name="Normal Table"/>
     <w:lsdException w:qFormat="1" w:unhideWhenUsed="0" w:uiPriority="0" w:semiHidden="0" w:name="annotation subject"/>
     <w:lsdException w:qFormat="1" w:unhideWhenUsed="0" w:uiPriority="0" w:semiHidden="0" w:name="Table Simple 1"/>
@@ -1174,7 +1320,7 @@
     <w:lsdException w:qFormat="1" w:unhideWhenUsed="0" w:uiPriority="0" w:semiHidden="0" w:name="Table List 7"/>
     <w:lsdException w:qFormat="1" w:unhideWhenUsed="0" w:uiPriority="0" w:semiHidden="0" w:name="Table List 8"/>
     <w:lsdException w:qFormat="1" w:unhideWhenUsed="0" w:uiPriority="0" w:semiHidden="0" w:name="Table 3D effects 1"/>
-    <w:lsdException w:unhideWhenUsed="0" w:uiPriority="0" w:semiHidden="0" w:name="Table 3D effects 2"/>
+    <w:lsdException w:qFormat="1" w:unhideWhenUsed="0" w:uiPriority="0" w:semiHidden="0" w:name="Table 3D effects 2"/>
     <w:lsdException w:qFormat="1" w:unhideWhenUsed="0" w:uiPriority="0" w:semiHidden="0" w:name="Table 3D effects 3"/>
     <w:lsdException w:qFormat="1" w:unhideWhenUsed="0" w:uiPriority="0" w:semiHidden="0" w:name="Table Contemporary"/>
     <w:lsdException w:qFormat="1" w:unhideWhenUsed="0" w:uiPriority="0" w:semiHidden="0" w:name="Table Elegant"/>
@@ -1184,7 +1330,7 @@
     <w:lsdException w:qFormat="1" w:unhideWhenUsed="0" w:uiPriority="0" w:semiHidden="0" w:name="Table Web 1"/>
     <w:lsdException w:qFormat="1" w:unhideWhenUsed="0" w:uiPriority="0" w:semiHidden="0" w:name="Table Web 2"/>
     <w:lsdException w:qFormat="1" w:unhideWhenUsed="0" w:uiPriority="0" w:semiHidden="0" w:name="Table Web 3"/>
-    <w:lsdException w:unhideWhenUsed="0" w:uiPriority="0" w:semiHidden="0" w:name="Balloon Text"/>
+    <w:lsdException w:qFormat="1" w:unhideWhenUsed="0" w:uiPriority="0" w:semiHidden="0" w:name="Balloon Text"/>
     <w:lsdException w:qFormat="1" w:unhideWhenUsed="0" w:uiPriority="0" w:semiHidden="0" w:name="Table Grid"/>
     <w:lsdException w:qFormat="1" w:unhideWhenUsed="0" w:uiPriority="0" w:semiHidden="0" w:name="Table Theme"/>
     <w:lsdException w:qFormat="1" w:unhideWhenUsed="0" w:uiPriority="60" w:semiHidden="0" w:name="Light Shading"/>
@@ -1490,6 +1636,7 @@
   <w:style w:type="paragraph" w:styleId="13">
     <w:name w:val="Balloon Text"/>
     <w:basedOn w:val="1"/>
+    <w:qFormat/>
     <w:uiPriority w:val="0"/>
     <w:rPr>
       <w:sz w:val="16"/>
@@ -1499,6 +1646,7 @@
   <w:style w:type="paragraph" w:styleId="14">
     <w:name w:val="Block Text"/>
     <w:basedOn w:val="1"/>
+    <w:qFormat/>
     <w:uiPriority w:val="0"/>
     <w:pPr>
       <w:spacing w:after="120"/>
@@ -1517,6 +1665,7 @@
   <w:style w:type="paragraph" w:styleId="16">
     <w:name w:val="Body Text 2"/>
     <w:basedOn w:val="1"/>
+    <w:qFormat/>
     <w:uiPriority w:val="0"/>
     <w:pPr>
       <w:spacing w:after="120" w:line="480" w:lineRule="auto"/>
@@ -1557,6 +1706,7 @@
   <w:style w:type="paragraph" w:styleId="20">
     <w:name w:val="Body Text First Indent 2"/>
     <w:basedOn w:val="19"/>
+    <w:qFormat/>
     <w:uiPriority w:val="0"/>
     <w:pPr>
       <w:ind w:firstLine="420" w:firstLineChars="200"/>
@@ -1647,6 +1797,7 @@
   <w:style w:type="paragraph" w:styleId="29">
     <w:name w:val="Document Map"/>
     <w:basedOn w:val="1"/>
+    <w:qFormat/>
     <w:uiPriority w:val="0"/>
     <w:pPr>
       <w:shd w:val="clear" w:color="auto" w:fill="000080"/>
@@ -1655,6 +1806,7 @@
   <w:style w:type="paragraph" w:styleId="30">
     <w:name w:val="E-mail Signature"/>
     <w:basedOn w:val="1"/>
+    <w:qFormat/>
     <w:uiPriority w:val="0"/>
   </w:style>
   <w:style w:type="character" w:styleId="31">
@@ -1670,6 +1822,7 @@
   <w:style w:type="character" w:styleId="32">
     <w:name w:val="endnote reference"/>
     <w:basedOn w:val="11"/>
+    <w:qFormat/>
     <w:uiPriority w:val="0"/>
     <w:rPr>
       <w:vertAlign w:val="superscript"/>
@@ -1678,6 +1831,7 @@
   <w:style w:type="paragraph" w:styleId="33">
     <w:name w:val="endnote text"/>
     <w:basedOn w:val="1"/>
+    <w:qFormat/>
     <w:uiPriority w:val="0"/>
     <w:pPr>
       <w:snapToGrid w:val="0"/>
@@ -1687,6 +1841,7 @@
   <w:style w:type="paragraph" w:styleId="34">
     <w:name w:val="envelope address"/>
     <w:basedOn w:val="1"/>
+    <w:qFormat/>
     <w:uiPriority w:val="0"/>
     <w:pPr>
       <w:framePr w:w="7920" w:h="1980" w:hRule="exact" w:hSpace="180" w:wrap="auto" w:vAnchor="margin" w:hAnchor="page" w:xAlign="center" w:yAlign="bottom"/>
@@ -1702,6 +1857,7 @@
   <w:style w:type="paragraph" w:styleId="35">
     <w:name w:val="envelope return"/>
     <w:basedOn w:val="1"/>
+    <w:qFormat/>
     <w:uiPriority w:val="0"/>
     <w:pPr>
       <w:snapToGrid w:val="0"/>
@@ -1713,6 +1869,7 @@
   <w:style w:type="character" w:styleId="36">
     <w:name w:val="FollowedHyperlink"/>
     <w:basedOn w:val="11"/>
+    <w:qFormat/>
     <w:uiPriority w:val="0"/>
     <w:rPr>
       <w:color w:val="800080"/>
@@ -1722,6 +1879,7 @@
   <w:style w:type="paragraph" w:styleId="37">
     <w:name w:val="footer"/>
     <w:basedOn w:val="1"/>
+    <w:qFormat/>
     <w:uiPriority w:val="0"/>
     <w:pPr>
       <w:tabs>
@@ -1747,6 +1905,7 @@
   <w:style w:type="paragraph" w:styleId="39">
     <w:name w:val="footnote text"/>
     <w:basedOn w:val="1"/>
+    <w:qFormat/>
     <w:uiPriority w:val="0"/>
     <w:pPr>
       <w:snapToGrid w:val="0"/>
@@ -1760,6 +1919,7 @@
   <w:style w:type="paragraph" w:styleId="40">
     <w:name w:val="header"/>
     <w:basedOn w:val="1"/>
+    <w:qFormat/>
     <w:uiPriority w:val="0"/>
     <w:pPr>
       <w:tabs>
@@ -1776,11 +1936,13 @@
   <w:style w:type="character" w:styleId="41">
     <w:name w:val="HTML Acronym"/>
     <w:basedOn w:val="11"/>
+    <w:qFormat/>
     <w:uiPriority w:val="0"/>
   </w:style>
   <w:style w:type="paragraph" w:styleId="42">
     <w:name w:val="HTML Address"/>
     <w:basedOn w:val="1"/>
+    <w:qFormat/>
     <w:uiPriority w:val="0"/>
     <w:rPr>
       <w:i/>
@@ -1790,6 +1952,7 @@
   <w:style w:type="character" w:styleId="43">
     <w:name w:val="HTML Cite"/>
     <w:basedOn w:val="11"/>
+    <w:qFormat/>
     <w:uiPriority w:val="0"/>
     <w:rPr>
       <w:i/>
@@ -1799,6 +1962,7 @@
   <w:style w:type="character" w:styleId="44">
     <w:name w:val="HTML Code"/>
     <w:basedOn w:val="11"/>
+    <w:qFormat/>
     <w:uiPriority w:val="0"/>
     <w:rPr>
       <w:rFonts w:ascii="Courier New" w:hAnsi="Courier New" w:cs="Courier New"/>
@@ -1809,6 +1973,7 @@
   <w:style w:type="character" w:styleId="45">
     <w:name w:val="HTML Definition"/>
     <w:basedOn w:val="11"/>
+    <w:qFormat/>
     <w:uiPriority w:val="0"/>
     <w:rPr>
       <w:i/>
@@ -1818,6 +1983,7 @@
   <w:style w:type="character" w:styleId="46">
     <w:name w:val="HTML Keyboard"/>
     <w:basedOn w:val="11"/>
+    <w:qFormat/>
     <w:uiPriority w:val="0"/>
     <w:rPr>
       <w:rFonts w:ascii="Courier New" w:hAnsi="Courier New" w:cs="Courier New"/>
@@ -1828,6 +1994,7 @@
   <w:style w:type="paragraph" w:styleId="47">
     <w:name w:val="HTML Preformatted"/>
     <w:basedOn w:val="1"/>
+    <w:qFormat/>
     <w:uiPriority w:val="0"/>
     <w:rPr>
       <w:rFonts w:ascii="Courier New" w:hAnsi="Courier New" w:cs="Courier New"/>
@@ -1837,6 +2004,7 @@
   <w:style w:type="character" w:styleId="48">
     <w:name w:val="HTML Sample"/>
     <w:basedOn w:val="11"/>
+    <w:qFormat/>
     <w:uiPriority w:val="0"/>
     <w:rPr>
       <w:rFonts w:ascii="Courier New" w:hAnsi="Courier New" w:cs="Courier New"/>
@@ -1845,6 +2013,7 @@
   <w:style w:type="character" w:styleId="49">
     <w:name w:val="HTML Typewriter"/>
     <w:basedOn w:val="11"/>
+    <w:qFormat/>
     <w:uiPriority w:val="0"/>
     <w:rPr>
       <w:rFonts w:ascii="Courier New" w:hAnsi="Courier New" w:cs="Courier New"/>
@@ -1855,6 +2024,7 @@
   <w:style w:type="character" w:styleId="50">
     <w:name w:val="HTML Variable"/>
     <w:basedOn w:val="11"/>
+    <w:qFormat/>
     <w:uiPriority w:val="0"/>
     <w:rPr>
       <w:i/>
@@ -1864,6 +2034,7 @@
   <w:style w:type="character" w:styleId="51">
     <w:name w:val="Hyperlink"/>
     <w:basedOn w:val="11"/>
+    <w:qFormat/>
     <w:uiPriority w:val="0"/>
     <w:rPr>
       <w:color w:val="0000FF"/>
@@ -1874,12 +2045,14 @@
     <w:name w:val="index 1"/>
     <w:basedOn w:val="1"/>
     <w:next w:val="1"/>
+    <w:qFormat/>
     <w:uiPriority w:val="0"/>
   </w:style>
   <w:style w:type="paragraph" w:styleId="53">
     <w:name w:val="index 2"/>
     <w:basedOn w:val="1"/>
     <w:next w:val="1"/>
+    <w:qFormat/>
     <w:uiPriority w:val="0"/>
     <w:pPr>
       <w:ind w:left="200" w:leftChars="200"/>
@@ -1889,6 +2062,7 @@
     <w:name w:val="index 3"/>
     <w:basedOn w:val="1"/>
     <w:next w:val="1"/>
+    <w:qFormat/>
     <w:uiPriority w:val="0"/>
     <w:pPr>
       <w:ind w:left="400" w:leftChars="400"/>
@@ -1898,6 +2072,7 @@
     <w:name w:val="index 4"/>
     <w:basedOn w:val="1"/>
     <w:next w:val="1"/>
+    <w:qFormat/>
     <w:uiPriority w:val="0"/>
     <w:pPr>
       <w:ind w:left="600" w:leftChars="600"/>
@@ -1907,6 +2082,7 @@
     <w:name w:val="index 5"/>
     <w:basedOn w:val="1"/>
     <w:next w:val="1"/>
+    <w:qFormat/>
     <w:uiPriority w:val="0"/>
     <w:pPr>
       <w:ind w:left="800" w:leftChars="800"/>
@@ -1925,6 +2101,7 @@
     <w:name w:val="index 7"/>
     <w:basedOn w:val="1"/>
     <w:next w:val="1"/>
+    <w:qFormat/>
     <w:uiPriority w:val="0"/>
     <w:pPr>
       <w:ind w:left="1200" w:leftChars="1200"/>
@@ -1934,6 +2111,7 @@
     <w:name w:val="index 8"/>
     <w:basedOn w:val="1"/>
     <w:next w:val="1"/>
+    <w:qFormat/>
     <w:uiPriority w:val="0"/>
     <w:pPr>
       <w:ind w:left="1400" w:leftChars="1400"/>
@@ -1943,6 +2121,7 @@
     <w:name w:val="index 9"/>
     <w:basedOn w:val="1"/>
     <w:next w:val="1"/>
+    <w:qFormat/>
     <w:uiPriority w:val="0"/>
     <w:pPr>
       <w:ind w:left="1600" w:leftChars="1600"/>
@@ -1952,6 +2131,7 @@
     <w:name w:val="index heading"/>
     <w:basedOn w:val="1"/>
     <w:next w:val="52"/>
+    <w:qFormat/>
     <w:uiPriority w:val="0"/>
     <w:rPr>
       <w:rFonts w:ascii="Arial" w:hAnsi="Arial" w:cs="Arial"/>
@@ -1960,11 +2140,13 @@
   <w:style w:type="character" w:styleId="62">
     <w:name w:val="line number"/>
     <w:basedOn w:val="11"/>
+    <w:qFormat/>
     <w:uiPriority w:val="0"/>
   </w:style>
   <w:style w:type="paragraph" w:styleId="63">
     <w:name w:val="List"/>
     <w:basedOn w:val="1"/>
+    <w:qFormat/>
     <w:uiPriority w:val="0"/>
     <w:pPr>
       <w:ind w:left="200" w:hanging="200" w:hangingChars="200"/>
@@ -1973,6 +2155,7 @@
   <w:style w:type="paragraph" w:styleId="64">
     <w:name w:val="List 2"/>
     <w:basedOn w:val="1"/>
+    <w:qFormat/>
     <w:uiPriority w:val="0"/>
     <w:pPr>
       <w:ind w:left="100" w:leftChars="200" w:hanging="200" w:hangingChars="200"/>
@@ -1989,6 +2172,7 @@
   <w:style w:type="paragraph" w:styleId="66">
     <w:name w:val="List 4"/>
     <w:basedOn w:val="1"/>
+    <w:qFormat/>
     <w:uiPriority w:val="0"/>
     <w:pPr>
       <w:ind w:left="100" w:leftChars="600" w:hanging="200" w:hangingChars="200"/>
@@ -1997,6 +2181,7 @@
   <w:style w:type="paragraph" w:styleId="67">
     <w:name w:val="List 5"/>
     <w:basedOn w:val="1"/>
+    <w:qFormat/>
     <w:uiPriority w:val="0"/>
     <w:pPr>
       <w:ind w:left="100" w:leftChars="800" w:hanging="200" w:hangingChars="200"/>
@@ -2005,6 +2190,7 @@
   <w:style w:type="paragraph" w:styleId="68">
     <w:name w:val="List Bullet"/>
     <w:basedOn w:val="1"/>
+    <w:qFormat/>
     <w:uiPriority w:val="0"/>
     <w:pPr>
       <w:numPr>
@@ -2150,6 +2336,7 @@
   <w:style w:type="paragraph" w:styleId="81">
     <w:name w:val="List Number 4"/>
     <w:basedOn w:val="1"/>
+    <w:qFormat/>
     <w:uiPriority w:val="0"/>
     <w:pPr>
       <w:numPr>
@@ -2260,6 +2447,7 @@
   <w:style w:type="paragraph" w:styleId="89">
     <w:name w:val="Plain Text"/>
     <w:basedOn w:val="1"/>
+    <w:qFormat/>
     <w:uiPriority w:val="0"/>
     <w:rPr>
       <w:rFonts w:ascii="SimSun" w:hAnsi="Courier New" w:cs="Courier New"/>
@@ -2270,6 +2458,7 @@
     <w:name w:val="Salutation"/>
     <w:basedOn w:val="1"/>
     <w:next w:val="1"/>
+    <w:qFormat/>
     <w:uiPriority w:val="0"/>
   </w:style>
   <w:style w:type="paragraph" w:styleId="91">
@@ -2420,6 +2609,7 @@
   <w:style w:type="table" w:styleId="95">
     <w:name w:val="Table 3D effects 2"/>
     <w:basedOn w:val="12"/>
+    <w:qFormat/>
     <w:uiPriority w:val="0"/>
     <w:pPr>
       <w:widowControl w:val="0"/>

</xml_diff>

<commit_message>
docs: add content run KB8
</commit_message>
<xml_diff>
--- a/Slot13/saga-demo/Bao_cao_de190477.docx
+++ b/Slot13/saga-demo/Bao_cao_de190477.docx
@@ -883,8 +883,15 @@
           <w:lang w:val="vi-VN"/>
         </w:rPr>
       </w:pPr>
-      <w:bookmarkStart w:id="0" w:name="_GoBack"/>
-      <w:bookmarkEnd w:id="0"/>
+      <w:r>
+        <w:rPr>
+          <w:rFonts w:hint="default"/>
+          <w:sz w:val="26"/>
+          <w:szCs w:val="26"/>
+          <w:lang w:val="vi-VN"/>
+        </w:rPr>
+        <w:t>Để lúc khi gọi thanh toán, đảm bảo nó sẽ dừng 15 giây lại trước khi gọi thanh toán, tạo khoảng trống thời gian để tắt service</w:t>
+      </w:r>
     </w:p>
     <w:p>
       <w:pPr>
@@ -895,6 +902,417 @@
           <w:lang w:val="vi-VN"/>
         </w:rPr>
       </w:pPr>
+    </w:p>
+    <w:p>
+      <w:pPr>
+        <w:rPr>
+          <w:rFonts w:hint="default"/>
+          <w:sz w:val="26"/>
+          <w:szCs w:val="26"/>
+          <w:lang w:val="vi-VN"/>
+        </w:rPr>
+      </w:pPr>
+      <w:r>
+        <w:rPr>
+          <w:rFonts w:hint="default"/>
+          <w:sz w:val="26"/>
+          <w:szCs w:val="26"/>
+          <w:lang w:val="vi-VN"/>
+        </w:rPr>
+        <w:t>Bước 2:  Chạy postman</w:t>
+      </w:r>
+    </w:p>
+    <w:p>
+      <w:pPr>
+        <w:rPr>
+          <w:rFonts w:hint="default"/>
+          <w:sz w:val="26"/>
+          <w:szCs w:val="26"/>
+          <w:lang w:val="vi-VN"/>
+        </w:rPr>
+      </w:pPr>
+      <w:r>
+        <w:rPr>
+          <w:rFonts w:hint="default"/>
+          <w:sz w:val="26"/>
+          <w:szCs w:val="26"/>
+          <w:lang w:val="vi-VN"/>
+        </w:rPr>
+        <w:t>Vào postman, mở thư mục ko chạy bằng runner(Dùng chạy thủ công cho trường hợp này + sau khi import 2 file postman và environment)</w:t>
+      </w:r>
+    </w:p>
+    <w:p>
+      <w:pPr>
+        <w:rPr>
+          <w:rFonts w:hint="default"/>
+          <w:sz w:val="26"/>
+          <w:szCs w:val="26"/>
+          <w:lang w:val="vi-VN"/>
+        </w:rPr>
+      </w:pPr>
+    </w:p>
+    <w:p>
+      <w:pPr>
+        <w:rPr>
+          <w:rFonts w:hint="default"/>
+          <w:sz w:val="26"/>
+          <w:szCs w:val="26"/>
+          <w:lang w:val="vi-VN"/>
+        </w:rPr>
+      </w:pPr>
+      <w:r>
+        <w:drawing>
+          <wp:inline distT="0" distB="0" distL="114300" distR="114300">
+            <wp:extent cx="5266690" cy="2962910"/>
+            <wp:effectExtent l="0" t="0" r="6350" b="8890"/>
+            <wp:docPr id="9" name="Picture 1"/>
+            <wp:cNvGraphicFramePr>
+              <a:graphicFrameLocks xmlns:a="http://schemas.openxmlformats.org/drawingml/2006/main" noChangeAspect="1"/>
+            </wp:cNvGraphicFramePr>
+            <a:graphic xmlns:a="http://schemas.openxmlformats.org/drawingml/2006/main">
+              <a:graphicData uri="http://schemas.openxmlformats.org/drawingml/2006/picture">
+                <pic:pic xmlns:pic="http://schemas.openxmlformats.org/drawingml/2006/picture">
+                  <pic:nvPicPr>
+                    <pic:cNvPr id="9" name="Picture 1"/>
+                    <pic:cNvPicPr>
+                      <a:picLocks noChangeAspect="1"/>
+                    </pic:cNvPicPr>
+                  </pic:nvPicPr>
+                  <pic:blipFill>
+                    <a:blip r:embed="rId13"/>
+                    <a:stretch>
+                      <a:fillRect/>
+                    </a:stretch>
+                  </pic:blipFill>
+                  <pic:spPr>
+                    <a:xfrm>
+                      <a:off x="0" y="0"/>
+                      <a:ext cx="5266690" cy="2962910"/>
+                    </a:xfrm>
+                    <a:prstGeom prst="rect">
+                      <a:avLst/>
+                    </a:prstGeom>
+                    <a:noFill/>
+                    <a:ln>
+                      <a:noFill/>
+                    </a:ln>
+                  </pic:spPr>
+                </pic:pic>
+              </a:graphicData>
+            </a:graphic>
+          </wp:inline>
+        </w:drawing>
+      </w:r>
+    </w:p>
+    <w:p>
+      <w:pPr>
+        <w:rPr>
+          <w:rFonts w:hint="default"/>
+          <w:sz w:val="26"/>
+          <w:szCs w:val="26"/>
+          <w:lang w:val="vi-VN"/>
+        </w:rPr>
+      </w:pPr>
+    </w:p>
+    <w:p>
+      <w:pPr>
+        <w:rPr>
+          <w:rFonts w:hint="default"/>
+          <w:sz w:val="26"/>
+          <w:szCs w:val="26"/>
+          <w:lang w:val="vi-VN"/>
+        </w:rPr>
+      </w:pPr>
+      <w:r>
+        <w:rPr>
+          <w:rFonts w:hint="default"/>
+          <w:sz w:val="26"/>
+          <w:szCs w:val="26"/>
+          <w:lang w:val="vi-VN"/>
+        </w:rPr>
+        <w:t>Chạy snapshot trước để kiểm tra đơn hàng trước khi test</w:t>
+      </w:r>
+    </w:p>
+    <w:p>
+      <w:pPr>
+        <w:rPr>
+          <w:rFonts w:hint="default"/>
+          <w:sz w:val="26"/>
+          <w:szCs w:val="26"/>
+          <w:lang w:val="vi-VN"/>
+        </w:rPr>
+      </w:pPr>
+    </w:p>
+    <w:p>
+      <w:pPr>
+        <w:rPr>
+          <w:rFonts w:hint="default"/>
+          <w:sz w:val="26"/>
+          <w:szCs w:val="26"/>
+          <w:lang w:val="vi-VN"/>
+        </w:rPr>
+      </w:pPr>
+      <w:r>
+        <w:rPr>
+          <w:rFonts w:hint="default"/>
+          <w:sz w:val="26"/>
+          <w:szCs w:val="26"/>
+          <w:lang w:val="vi-VN"/>
+        </w:rPr>
+        <w:t>Chạy phần testcase đặt hàng dưới snapshot</w:t>
+      </w:r>
+    </w:p>
+    <w:p>
+      <w:pPr>
+        <w:rPr>
+          <w:rFonts w:hint="default"/>
+          <w:sz w:val="26"/>
+          <w:szCs w:val="26"/>
+          <w:lang w:val="vi-VN"/>
+        </w:rPr>
+      </w:pPr>
+    </w:p>
+    <w:p>
+      <w:r>
+        <w:drawing>
+          <wp:inline distT="0" distB="0" distL="114300" distR="114300">
+            <wp:extent cx="5266690" cy="2962910"/>
+            <wp:effectExtent l="0" t="0" r="6350" b="8890"/>
+            <wp:docPr id="10" name="Picture 2"/>
+            <wp:cNvGraphicFramePr>
+              <a:graphicFrameLocks xmlns:a="http://schemas.openxmlformats.org/drawingml/2006/main" noChangeAspect="1"/>
+            </wp:cNvGraphicFramePr>
+            <a:graphic xmlns:a="http://schemas.openxmlformats.org/drawingml/2006/main">
+              <a:graphicData uri="http://schemas.openxmlformats.org/drawingml/2006/picture">
+                <pic:pic xmlns:pic="http://schemas.openxmlformats.org/drawingml/2006/picture">
+                  <pic:nvPicPr>
+                    <pic:cNvPr id="10" name="Picture 2"/>
+                    <pic:cNvPicPr>
+                      <a:picLocks noChangeAspect="1"/>
+                    </pic:cNvPicPr>
+                  </pic:nvPicPr>
+                  <pic:blipFill>
+                    <a:blip r:embed="rId14"/>
+                    <a:stretch>
+                      <a:fillRect/>
+                    </a:stretch>
+                  </pic:blipFill>
+                  <pic:spPr>
+                    <a:xfrm>
+                      <a:off x="0" y="0"/>
+                      <a:ext cx="5266690" cy="2962910"/>
+                    </a:xfrm>
+                    <a:prstGeom prst="rect">
+                      <a:avLst/>
+                    </a:prstGeom>
+                    <a:noFill/>
+                    <a:ln>
+                      <a:noFill/>
+                    </a:ln>
+                  </pic:spPr>
+                </pic:pic>
+              </a:graphicData>
+            </a:graphic>
+          </wp:inline>
+        </w:drawing>
+      </w:r>
+    </w:p>
+    <w:p/>
+    <w:p>
+      <w:pPr>
+        <w:rPr>
+          <w:rFonts w:hint="default"/>
+          <w:lang w:val="vi-VN"/>
+        </w:rPr>
+      </w:pPr>
+      <w:r>
+        <w:rPr>
+          <w:rFonts w:hint="default"/>
+          <w:lang w:val="vi-VN"/>
+        </w:rPr>
+        <w:t>Khi chạy, chỉ có 15 giây để tắt service trong khi đơn hàng ở trạng thái sending request</w:t>
+      </w:r>
+    </w:p>
+    <w:p>
+      <w:pPr>
+        <w:rPr>
+          <w:rFonts w:hint="default"/>
+          <w:lang w:val="vi-VN"/>
+        </w:rPr>
+      </w:pPr>
+    </w:p>
+    <w:p>
+      <w:pPr>
+        <w:rPr>
+          <w:rFonts w:hint="default"/>
+          <w:lang w:val="vi-VN"/>
+        </w:rPr>
+      </w:pPr>
+      <w:r>
+        <w:rPr>
+          <w:rFonts w:hint="default"/>
+          <w:lang w:val="vi-VN"/>
+        </w:rPr>
+        <w:t>Mở bảng terminal, dán dòng lệnh để tạm dừng 2 service:</w:t>
+      </w:r>
+    </w:p>
+    <w:p>
+      <w:pPr>
+        <w:rPr>
+          <w:rFonts w:hint="default"/>
+          <w:lang w:val="vi-VN"/>
+        </w:rPr>
+      </w:pPr>
+    </w:p>
+    <w:p>
+      <w:pPr>
+        <w:rPr>
+          <w:rFonts w:hint="default"/>
+          <w:lang w:val="vi-VN"/>
+        </w:rPr>
+      </w:pPr>
+      <w:r>
+        <w:rPr>
+          <w:rFonts w:hint="default"/>
+          <w:color w:val="FF0000"/>
+          <w:lang w:val="vi-VN"/>
+        </w:rPr>
+        <w:t>docker compose stop payment-service inventory-service</w:t>
+      </w:r>
+    </w:p>
+    <w:p>
+      <w:pPr>
+        <w:rPr>
+          <w:rFonts w:hint="default"/>
+          <w:lang w:val="vi-VN"/>
+        </w:rPr>
+      </w:pPr>
+    </w:p>
+    <w:p>
+      <w:pPr>
+        <w:rPr>
+          <w:rFonts w:hint="default"/>
+          <w:lang w:val="vi-VN"/>
+        </w:rPr>
+      </w:pPr>
+      <w:r>
+        <w:rPr>
+          <w:rFonts w:hint="default"/>
+          <w:lang w:val="vi-VN"/>
+        </w:rPr>
+        <w:t>Sau đó quay lại postman để kiểm tra kết quả</w:t>
+      </w:r>
+    </w:p>
+    <w:p>
+      <w:pPr>
+        <w:rPr>
+          <w:rFonts w:hint="default"/>
+          <w:lang w:val="vi-VN"/>
+        </w:rPr>
+      </w:pPr>
+    </w:p>
+    <w:p>
+      <w:pPr>
+        <w:rPr>
+          <w:rFonts w:hint="default"/>
+          <w:lang w:val="vi-VN"/>
+        </w:rPr>
+      </w:pPr>
+      <w:r>
+        <w:rPr>
+          <w:rFonts w:hint="default"/>
+          <w:lang w:val="vi-VN"/>
+        </w:rPr>
+        <w:t>Bước 3: Bật lại service và xem saga log</w:t>
+      </w:r>
+    </w:p>
+    <w:p>
+      <w:pPr>
+        <w:rPr>
+          <w:rFonts w:hint="default"/>
+          <w:lang w:val="vi-VN"/>
+        </w:rPr>
+      </w:pPr>
+      <w:r>
+        <w:rPr>
+          <w:rFonts w:hint="default"/>
+          <w:lang w:val="vi-VN"/>
+        </w:rPr>
+        <w:t>Khôi phục lại service:</w:t>
+      </w:r>
+    </w:p>
+    <w:p>
+      <w:pPr>
+        <w:rPr>
+          <w:rFonts w:hint="default"/>
+          <w:lang w:val="vi-VN"/>
+        </w:rPr>
+      </w:pPr>
+    </w:p>
+    <w:p>
+      <w:pPr>
+        <w:rPr>
+          <w:rFonts w:hint="default"/>
+          <w:color w:val="FF0000"/>
+          <w:lang w:val="vi-VN"/>
+        </w:rPr>
+      </w:pPr>
+      <w:r>
+        <w:rPr>
+          <w:rFonts w:hint="default"/>
+          <w:color w:val="FF0000"/>
+          <w:lang w:val="vi-VN"/>
+        </w:rPr>
+        <w:t>docker compose start inventory-service payment-service</w:t>
+      </w:r>
+    </w:p>
+    <w:p>
+      <w:pPr>
+        <w:rPr>
+          <w:rFonts w:hint="default"/>
+          <w:lang w:val="vi-VN"/>
+        </w:rPr>
+      </w:pPr>
+    </w:p>
+    <w:p>
+      <w:pPr>
+        <w:rPr>
+          <w:rFonts w:hint="default"/>
+          <w:lang w:val="vi-VN"/>
+        </w:rPr>
+      </w:pPr>
+      <w:r>
+        <w:rPr>
+          <w:rFonts w:hint="default"/>
+          <w:lang w:val="vi-VN"/>
+        </w:rPr>
+        <w:t>Chạy postman [KB8] 4. saga logs để kiểm tra log của saga</w:t>
+      </w:r>
+    </w:p>
+    <w:p>
+      <w:pPr>
+        <w:rPr>
+          <w:rFonts w:hint="default"/>
+          <w:lang w:val="vi-VN"/>
+        </w:rPr>
+      </w:pPr>
+    </w:p>
+    <w:p>
+      <w:pPr>
+        <w:rPr>
+          <w:rFonts w:hint="default"/>
+          <w:lang w:val="vi-VN"/>
+        </w:rPr>
+      </w:pPr>
+      <w:r>
+        <w:rPr>
+          <w:rFonts w:hint="default"/>
+          <w:lang w:val="vi-VN"/>
+        </w:rPr>
+        <w:t>Sẽ thấy có 3 dòng compesation fail =&gt; thử nghiệm thành công</w:t>
+      </w:r>
+      <w:bookmarkStart w:id="0" w:name="_GoBack"/>
+      <w:bookmarkEnd w:id="0"/>
     </w:p>
     <w:sectPr>
       <w:headerReference r:id="rId3" w:type="default"/>

</xml_diff>

<commit_message>
docs: update docs Kb 8
</commit_message>
<xml_diff>
--- a/Slot13/saga-demo/Bao_cao_de190477.docx
+++ b/Slot13/saga-demo/Bao_cao_de190477.docx
@@ -884,6 +884,69 @@
         </w:rPr>
       </w:pPr>
       <w:r>
+        <w:drawing>
+          <wp:inline distT="0" distB="0" distL="114300" distR="114300">
+            <wp:extent cx="5266690" cy="2962910"/>
+            <wp:effectExtent l="0" t="0" r="6350" b="8890"/>
+            <wp:docPr id="11" name="Picture 3"/>
+            <wp:cNvGraphicFramePr>
+              <a:graphicFrameLocks xmlns:a="http://schemas.openxmlformats.org/drawingml/2006/main" noChangeAspect="1"/>
+            </wp:cNvGraphicFramePr>
+            <a:graphic xmlns:a="http://schemas.openxmlformats.org/drawingml/2006/main">
+              <a:graphicData uri="http://schemas.openxmlformats.org/drawingml/2006/picture">
+                <pic:pic xmlns:pic="http://schemas.openxmlformats.org/drawingml/2006/picture">
+                  <pic:nvPicPr>
+                    <pic:cNvPr id="11" name="Picture 3"/>
+                    <pic:cNvPicPr>
+                      <a:picLocks noChangeAspect="1"/>
+                    </pic:cNvPicPr>
+                  </pic:nvPicPr>
+                  <pic:blipFill>
+                    <a:blip r:embed="rId13"/>
+                    <a:stretch>
+                      <a:fillRect/>
+                    </a:stretch>
+                  </pic:blipFill>
+                  <pic:spPr>
+                    <a:xfrm>
+                      <a:off x="0" y="0"/>
+                      <a:ext cx="5266690" cy="2962910"/>
+                    </a:xfrm>
+                    <a:prstGeom prst="rect">
+                      <a:avLst/>
+                    </a:prstGeom>
+                    <a:noFill/>
+                    <a:ln>
+                      <a:noFill/>
+                    </a:ln>
+                  </pic:spPr>
+                </pic:pic>
+              </a:graphicData>
+            </a:graphic>
+          </wp:inline>
+        </w:drawing>
+      </w:r>
+    </w:p>
+    <w:p>
+      <w:pPr>
+        <w:rPr>
+          <w:rFonts w:hint="default"/>
+          <w:sz w:val="26"/>
+          <w:szCs w:val="26"/>
+          <w:lang w:val="vi-VN"/>
+        </w:rPr>
+      </w:pPr>
+    </w:p>
+    <w:p>
+      <w:pPr>
+        <w:rPr>
+          <w:rFonts w:hint="default"/>
+          <w:sz w:val="26"/>
+          <w:szCs w:val="26"/>
+          <w:lang w:val="vi-VN"/>
+        </w:rPr>
+      </w:pPr>
+      <w:r>
         <w:rPr>
           <w:rFonts w:hint="default"/>
           <w:sz w:val="26"/>
@@ -965,7 +1028,7 @@
           <wp:inline distT="0" distB="0" distL="114300" distR="114300">
             <wp:extent cx="5266690" cy="2962910"/>
             <wp:effectExtent l="0" t="0" r="6350" b="8890"/>
-            <wp:docPr id="9" name="Picture 1"/>
+            <wp:docPr id="12" name="Picture 4"/>
             <wp:cNvGraphicFramePr>
               <a:graphicFrameLocks xmlns:a="http://schemas.openxmlformats.org/drawingml/2006/main" noChangeAspect="1"/>
             </wp:cNvGraphicFramePr>
@@ -973,13 +1036,13 @@
               <a:graphicData uri="http://schemas.openxmlformats.org/drawingml/2006/picture">
                 <pic:pic xmlns:pic="http://schemas.openxmlformats.org/drawingml/2006/picture">
                   <pic:nvPicPr>
-                    <pic:cNvPr id="9" name="Picture 1"/>
+                    <pic:cNvPr id="12" name="Picture 4"/>
                     <pic:cNvPicPr>
                       <a:picLocks noChangeAspect="1"/>
                     </pic:cNvPicPr>
                   </pic:nvPicPr>
                   <pic:blipFill>
-                    <a:blip r:embed="rId13"/>
+                    <a:blip r:embed="rId14"/>
                     <a:stretch>
                       <a:fillRect/>
                     </a:stretch>
@@ -1092,7 +1155,7 @@
                     </pic:cNvPicPr>
                   </pic:nvPicPr>
                   <pic:blipFill>
-                    <a:blip r:embed="rId14"/>
+                    <a:blip r:embed="rId15"/>
                     <a:stretch>
                       <a:fillRect/>
                     </a:stretch>
@@ -1134,6 +1197,51 @@
       </w:r>
     </w:p>
     <w:p>
+      <w:r>
+        <w:drawing>
+          <wp:inline distT="0" distB="0" distL="114300" distR="114300">
+            <wp:extent cx="5266690" cy="2962910"/>
+            <wp:effectExtent l="0" t="0" r="6350" b="8890"/>
+            <wp:docPr id="13" name="Picture 5"/>
+            <wp:cNvGraphicFramePr>
+              <a:graphicFrameLocks xmlns:a="http://schemas.openxmlformats.org/drawingml/2006/main" noChangeAspect="1"/>
+            </wp:cNvGraphicFramePr>
+            <a:graphic xmlns:a="http://schemas.openxmlformats.org/drawingml/2006/main">
+              <a:graphicData uri="http://schemas.openxmlformats.org/drawingml/2006/picture">
+                <pic:pic xmlns:pic="http://schemas.openxmlformats.org/drawingml/2006/picture">
+                  <pic:nvPicPr>
+                    <pic:cNvPr id="13" name="Picture 5"/>
+                    <pic:cNvPicPr>
+                      <a:picLocks noChangeAspect="1"/>
+                    </pic:cNvPicPr>
+                  </pic:nvPicPr>
+                  <pic:blipFill>
+                    <a:blip r:embed="rId16"/>
+                    <a:stretch>
+                      <a:fillRect/>
+                    </a:stretch>
+                  </pic:blipFill>
+                  <pic:spPr>
+                    <a:xfrm>
+                      <a:off x="0" y="0"/>
+                      <a:ext cx="5266690" cy="2962910"/>
+                    </a:xfrm>
+                    <a:prstGeom prst="rect">
+                      <a:avLst/>
+                    </a:prstGeom>
+                    <a:noFill/>
+                    <a:ln>
+                      <a:noFill/>
+                    </a:ln>
+                  </pic:spPr>
+                </pic:pic>
+              </a:graphicData>
+            </a:graphic>
+          </wp:inline>
+        </w:drawing>
+      </w:r>
+    </w:p>
+    <w:p>
       <w:pPr>
         <w:rPr>
           <w:rFonts w:hint="default"/>
@@ -1168,6 +1276,7 @@
       <w:pPr>
         <w:rPr>
           <w:rFonts w:hint="default"/>
+          <w:color w:val="FF0000"/>
           <w:lang w:val="vi-VN"/>
         </w:rPr>
       </w:pPr>
@@ -1178,6 +1287,58 @@
           <w:lang w:val="vi-VN"/>
         </w:rPr>
         <w:t>docker compose stop payment-service inventory-service</w:t>
+      </w:r>
+    </w:p>
+    <w:p>
+      <w:pPr>
+        <w:rPr>
+          <w:rFonts w:hint="default"/>
+          <w:color w:val="FF0000"/>
+          <w:lang w:val="vi-VN"/>
+        </w:rPr>
+      </w:pPr>
+      <w:r>
+        <w:drawing>
+          <wp:inline distT="0" distB="0" distL="114300" distR="114300">
+            <wp:extent cx="5268595" cy="563880"/>
+            <wp:effectExtent l="0" t="0" r="4445" b="0"/>
+            <wp:docPr id="14" name="Picture 6"/>
+            <wp:cNvGraphicFramePr>
+              <a:graphicFrameLocks xmlns:a="http://schemas.openxmlformats.org/drawingml/2006/main" noChangeAspect="1"/>
+            </wp:cNvGraphicFramePr>
+            <a:graphic xmlns:a="http://schemas.openxmlformats.org/drawingml/2006/main">
+              <a:graphicData uri="http://schemas.openxmlformats.org/drawingml/2006/picture">
+                <pic:pic xmlns:pic="http://schemas.openxmlformats.org/drawingml/2006/picture">
+                  <pic:nvPicPr>
+                    <pic:cNvPr id="14" name="Picture 6"/>
+                    <pic:cNvPicPr>
+                      <a:picLocks noChangeAspect="1"/>
+                    </pic:cNvPicPr>
+                  </pic:nvPicPr>
+                  <pic:blipFill>
+                    <a:blip r:embed="rId17"/>
+                    <a:stretch>
+                      <a:fillRect/>
+                    </a:stretch>
+                  </pic:blipFill>
+                  <pic:spPr>
+                    <a:xfrm>
+                      <a:off x="0" y="0"/>
+                      <a:ext cx="5268595" cy="563880"/>
+                    </a:xfrm>
+                    <a:prstGeom prst="rect">
+                      <a:avLst/>
+                    </a:prstGeom>
+                    <a:noFill/>
+                    <a:ln>
+                      <a:noFill/>
+                    </a:ln>
+                  </pic:spPr>
+                </pic:pic>
+              </a:graphicData>
+            </a:graphic>
+          </wp:inline>
+        </w:drawing>
       </w:r>
     </w:p>
     <w:p>
@@ -1201,6 +1362,57 @@
           <w:lang w:val="vi-VN"/>
         </w:rPr>
         <w:t>Sau đó quay lại postman để kiểm tra kết quả</w:t>
+      </w:r>
+    </w:p>
+    <w:p>
+      <w:pPr>
+        <w:rPr>
+          <w:rFonts w:hint="default"/>
+          <w:lang w:val="vi-VN"/>
+        </w:rPr>
+      </w:pPr>
+      <w:r>
+        <w:drawing>
+          <wp:inline distT="0" distB="0" distL="114300" distR="114300">
+            <wp:extent cx="5266690" cy="2962910"/>
+            <wp:effectExtent l="0" t="0" r="6350" b="8890"/>
+            <wp:docPr id="15" name="Picture 7"/>
+            <wp:cNvGraphicFramePr>
+              <a:graphicFrameLocks xmlns:a="http://schemas.openxmlformats.org/drawingml/2006/main" noChangeAspect="1"/>
+            </wp:cNvGraphicFramePr>
+            <a:graphic xmlns:a="http://schemas.openxmlformats.org/drawingml/2006/main">
+              <a:graphicData uri="http://schemas.openxmlformats.org/drawingml/2006/picture">
+                <pic:pic xmlns:pic="http://schemas.openxmlformats.org/drawingml/2006/picture">
+                  <pic:nvPicPr>
+                    <pic:cNvPr id="15" name="Picture 7"/>
+                    <pic:cNvPicPr>
+                      <a:picLocks noChangeAspect="1"/>
+                    </pic:cNvPicPr>
+                  </pic:nvPicPr>
+                  <pic:blipFill>
+                    <a:blip r:embed="rId18"/>
+                    <a:stretch>
+                      <a:fillRect/>
+                    </a:stretch>
+                  </pic:blipFill>
+                  <pic:spPr>
+                    <a:xfrm>
+                      <a:off x="0" y="0"/>
+                      <a:ext cx="5266690" cy="2962910"/>
+                    </a:xfrm>
+                    <a:prstGeom prst="rect">
+                      <a:avLst/>
+                    </a:prstGeom>
+                    <a:noFill/>
+                    <a:ln>
+                      <a:noFill/>
+                    </a:ln>
+                  </pic:spPr>
+                </pic:pic>
+              </a:graphicData>
+            </a:graphic>
+          </wp:inline>
+        </w:drawing>
       </w:r>
     </w:p>
     <w:p>
@@ -1273,6 +1485,49 @@
           <w:lang w:val="vi-VN"/>
         </w:rPr>
       </w:pPr>
+      <w:r>
+        <w:drawing>
+          <wp:inline distT="0" distB="0" distL="114300" distR="114300">
+            <wp:extent cx="5267325" cy="1260475"/>
+            <wp:effectExtent l="0" t="0" r="5715" b="4445"/>
+            <wp:docPr id="16" name="Picture 8"/>
+            <wp:cNvGraphicFramePr>
+              <a:graphicFrameLocks xmlns:a="http://schemas.openxmlformats.org/drawingml/2006/main" noChangeAspect="1"/>
+            </wp:cNvGraphicFramePr>
+            <a:graphic xmlns:a="http://schemas.openxmlformats.org/drawingml/2006/main">
+              <a:graphicData uri="http://schemas.openxmlformats.org/drawingml/2006/picture">
+                <pic:pic xmlns:pic="http://schemas.openxmlformats.org/drawingml/2006/picture">
+                  <pic:nvPicPr>
+                    <pic:cNvPr id="16" name="Picture 8"/>
+                    <pic:cNvPicPr>
+                      <a:picLocks noChangeAspect="1"/>
+                    </pic:cNvPicPr>
+                  </pic:nvPicPr>
+                  <pic:blipFill>
+                    <a:blip r:embed="rId19"/>
+                    <a:stretch>
+                      <a:fillRect/>
+                    </a:stretch>
+                  </pic:blipFill>
+                  <pic:spPr>
+                    <a:xfrm>
+                      <a:off x="0" y="0"/>
+                      <a:ext cx="5267325" cy="1260475"/>
+                    </a:xfrm>
+                    <a:prstGeom prst="rect">
+                      <a:avLst/>
+                    </a:prstGeom>
+                    <a:noFill/>
+                    <a:ln>
+                      <a:noFill/>
+                    </a:ln>
+                  </pic:spPr>
+                </pic:pic>
+              </a:graphicData>
+            </a:graphic>
+          </wp:inline>
+        </w:drawing>
+      </w:r>
     </w:p>
     <w:p>
       <w:pPr>
@@ -1305,14 +1560,65 @@
         </w:rPr>
       </w:pPr>
       <w:r>
+        <w:drawing>
+          <wp:inline distT="0" distB="0" distL="114300" distR="114300">
+            <wp:extent cx="5267960" cy="2386330"/>
+            <wp:effectExtent l="0" t="0" r="5080" b="6350"/>
+            <wp:docPr id="17" name="Picture 9"/>
+            <wp:cNvGraphicFramePr>
+              <a:graphicFrameLocks xmlns:a="http://schemas.openxmlformats.org/drawingml/2006/main" noChangeAspect="1"/>
+            </wp:cNvGraphicFramePr>
+            <a:graphic xmlns:a="http://schemas.openxmlformats.org/drawingml/2006/main">
+              <a:graphicData uri="http://schemas.openxmlformats.org/drawingml/2006/picture">
+                <pic:pic xmlns:pic="http://schemas.openxmlformats.org/drawingml/2006/picture">
+                  <pic:nvPicPr>
+                    <pic:cNvPr id="17" name="Picture 9"/>
+                    <pic:cNvPicPr>
+                      <a:picLocks noChangeAspect="1"/>
+                    </pic:cNvPicPr>
+                  </pic:nvPicPr>
+                  <pic:blipFill>
+                    <a:blip r:embed="rId20"/>
+                    <a:stretch>
+                      <a:fillRect/>
+                    </a:stretch>
+                  </pic:blipFill>
+                  <pic:spPr>
+                    <a:xfrm>
+                      <a:off x="0" y="0"/>
+                      <a:ext cx="5267960" cy="2386330"/>
+                    </a:xfrm>
+                    <a:prstGeom prst="rect">
+                      <a:avLst/>
+                    </a:prstGeom>
+                    <a:noFill/>
+                    <a:ln>
+                      <a:noFill/>
+                    </a:ln>
+                  </pic:spPr>
+                </pic:pic>
+              </a:graphicData>
+            </a:graphic>
+          </wp:inline>
+        </w:drawing>
+      </w:r>
+      <w:bookmarkStart w:id="0" w:name="_GoBack"/>
+      <w:bookmarkEnd w:id="0"/>
+    </w:p>
+    <w:p>
+      <w:pPr>
+        <w:rPr>
+          <w:rFonts w:hint="default"/>
+          <w:lang w:val="vi-VN"/>
+        </w:rPr>
+      </w:pPr>
+      <w:r>
         <w:rPr>
           <w:rFonts w:hint="default"/>
           <w:lang w:val="vi-VN"/>
         </w:rPr>
         <w:t>Sẽ thấy có 3 dòng compesation fail =&gt; thử nghiệm thành công</w:t>
       </w:r>
-      <w:bookmarkStart w:id="0" w:name="_GoBack"/>
-      <w:bookmarkEnd w:id="0"/>
     </w:p>
     <w:sectPr>
       <w:headerReference r:id="rId3" w:type="default"/>

</xml_diff>